<commit_message>
Privacy and Terms: HELP and STOP in bold
Co-Authored-By: Claude Opus 5.5 <noreply@anthropic.com>
Claude-Session: https://claude.ai/code/session_01UvstzJAZPbp2Wf3zcn662S
</commit_message>
<xml_diff>
--- a/HDDR-documents/HDDR-Privacy-Policy.docx
+++ b/HDDR-documents/HDDR-Privacy-Policy.docx
@@ -351,7 +351,27 @@
         <w:spacing w:after="60"/>
       </w:pPr>
       <w:r>
-        <w:t xml:space="preserve">Message and data rates may apply. Reply HELP for help, or STOP to stop texts at any time. You can also turn texts off in your account.</w:t>
+        <w:t xml:space="preserve">Message and data rates may apply. Reply </w:t>
+      </w:r>
+      <w:r>
+        <w:rPr>
+          <w:b/>
+          <w:bCs/>
+        </w:rPr>
+        <w:t xml:space="preserve">HELP</w:t>
+      </w:r>
+      <w:r>
+        <w:t xml:space="preserve"> for help, or </w:t>
+      </w:r>
+      <w:r>
+        <w:rPr>
+          <w:b/>
+          <w:bCs/>
+        </w:rPr>
+        <w:t xml:space="preserve">STOP</w:t>
+      </w:r>
+      <w:r>
+        <w:t xml:space="preserve"> to stop texts at any time. You can also turn texts off in your account.</w:t>
       </w:r>
     </w:p>
     <w:p>

</xml_diff>